<commit_message>
docs(catalog): fix broken TOC anchor for Shared Spine section
Heading "Shared Spine & Infrastructure" produced different anchors in GitHub
(double hyphen) vs pandoc (single hyphen) because of the "&". Drop the "&" so
both renderers generate the same id (shared-spine-and-infrastructure). Clears
the weasyprint "No anchor" warning. Regenerated catalog .docx/.pdf.

Co-Authored-By: Claude Opus 4.8 (1M context) <noreply@anthropic.com>
</commit_message>
<xml_diff>
--- a/docs/manual/FEATURE_CATALOG.docx
+++ b/docs/manual/FEATURE_CATALOG.docx
@@ -209,12 +209,12 @@
           <w:ilvl w:val="0"/>
         </w:numPr>
       </w:pPr>
-      <w:hyperlink w:anchor="shared-spine--infrastructure">
+      <w:hyperlink w:anchor="shared-spine-and-infrastructure">
         <w:r>
           <w:rPr>
             <w:rStyle w:val="Hyperlink"/>
           </w:rPr>
-          <w:t xml:space="preserve">Shared Spine &amp; Infrastructure — Features 41–60</w:t>
+          <w:t xml:space="preserve">Shared Spine and Infrastructure — Features 41–60</w:t>
         </w:r>
       </w:hyperlink>
     </w:p>
@@ -4414,9 +4414,9 @@
       <w:pPr>
         <w:pStyle w:val="Heading2"/>
       </w:pPr>
-      <w:bookmarkStart w:id="65" w:name="shared-spine-infrastructure"/>
-      <w:r>
-        <w:t xml:space="preserve">Shared Spine &amp; Infrastructure</w:t>
+      <w:bookmarkStart w:id="65" w:name="shared-spine-and-infrastructure"/>
+      <w:r>
+        <w:t xml:space="preserve">Shared Spine and Infrastructure</w:t>
       </w:r>
       <w:bookmarkEnd w:id="65"/>
     </w:p>

</xml_diff>

<commit_message>
docs(catalog): add 15 missing flagship capabilities (Features 61-75)
The catalog is a curated flagship-feature doc, not a route enumeration, so a
capability-level review (not a path grep) found whole categories absent from the
original 60. Added Features 61-75 in the catalog's 4-part style + grouping
convention: My Health Hub (Cures Act patient portal), Specialty Clinical Module
Suite (8 modules), CPOE (ONC certified), AI Shift Handoff & Transfer, Quality
Measures, CCM Autopilot, Result Escalation & Care Gaps, Clinician RPM Dashboard,
MCP Server Suite (20 servers), Revenue Cycle Completion Suite, HIPAA Compliance
Operations Suite, DSI Transparency/HTI-1, Staff Resilience & Wellness, EMS
Coordinated Response, Community Safety Partner Programs. Updated summary counts
(60->75) and TOC. Regenerated catalog .docx/.pdf.

Co-Authored-By: Claude Opus 4.8 (1M context) <noreply@anthropic.com>
</commit_message>
<xml_diff>
--- a/docs/manual/FEATURE_CATALOG.docx
+++ b/docs/manual/FEATURE_CATALOG.docx
@@ -219,6 +219,23 @@
       </w:hyperlink>
     </w:p>
     <w:p>
+      <w:pPr>
+        <w:pStyle w:val="Compact"/>
+        <w:numPr>
+          <w:numId w:val="1001"/>
+          <w:ilvl w:val="0"/>
+        </w:numPr>
+      </w:pPr>
+      <w:hyperlink w:anchor="X56b32e96b569d9eb904c6dd15c8238ad2c04f32">
+        <w:r>
+          <w:rPr>
+            <w:rStyle w:val="Hyperlink"/>
+          </w:rPr>
+          <w:t xml:space="preserve">Recently Added Capabilities — Features 61–75</w:t>
+        </w:r>
+      </w:hyperlink>
+    </w:p>
+    <w:p>
       <w:r>
         <w:pict>
           <v:rect style="width:0;height:1.5pt" o:hralign="center" o:hrstd="t" o:hr="t"/>
@@ -6463,11 +6480,1403 @@
       <w:pPr>
         <w:pStyle w:val="Heading2"/>
       </w:pPr>
-      <w:bookmarkStart w:id="86" w:name="summary-statistics"/>
+      <w:bookmarkStart w:id="86" w:name="X56b32e96b569d9eb904c6dd15c8238ad2c04f32"/>
+      <w:r>
+        <w:t xml:space="preserve">Recently Added Capabilities (Features 61–75)</w:t>
+      </w:r>
+      <w:bookmarkEnd w:id="86"/>
+    </w:p>
+    <w:p>
+      <w:pPr>
+        <w:pStyle w:val="FirstParagraph"/>
+      </w:pPr>
+      <w:r>
+        <w:t xml:space="preserve">These flagship capabilities exist in the live platform but were not in the original 60-feature catalog. Added 2026-06-11 after a full app-surface review. Several are grouped suites (matching the catalog’s existing convention, e.g. </w:t>
+      </w:r>
+      <w:r>
+        <w:t xml:space="preserve">“</w:t>
+      </w:r>
+      <w:r>
+        <w:t xml:space="preserve">SOC2 Compliance Dashboard Suite</w:t>
+      </w:r>
+      <w:r>
+        <w:t xml:space="preserve">”</w:t>
+      </w:r>
+      <w:r>
+        <w:t xml:space="preserve">).</w:t>
+      </w:r>
+    </w:p>
+    <w:p>
+      <w:pPr>
+        <w:pStyle w:val="Heading3"/>
+      </w:pPr>
+      <w:bookmarkStart w:id="87" w:name="Xb397212270aaf89f6917ef100236c4590d4ae6b"/>
+      <w:r>
+        <w:t xml:space="preserve">Feature 61: My Health Hub — Patient Record Portal (21st Century Cures Act)</w:t>
+      </w:r>
+      <w:bookmarkEnd w:id="87"/>
+    </w:p>
+    <w:p>
+      <w:pPr>
+        <w:pStyle w:val="FirstParagraph"/>
+      </w:pPr>
+      <w:r>
+        <w:rPr>
+          <w:b/>
+        </w:rPr>
+        <w:t xml:space="preserve">Primary Function:</w:t>
+      </w:r>
+      <w:r>
+        <w:t xml:space="preserve"> </w:t>
+      </w:r>
+      <w:r>
+        <w:t xml:space="preserve">A patient-facing portal giving seniors and members electronic access to their own clinical records — health observations and vitals, immunizations, active care plans, allergies, conditions, and a records export (PDF, FHIR, C-CDA, CSV). Central hub at</w:t>
+      </w:r>
+      <w:r>
+        <w:t xml:space="preserve"> </w:t>
+      </w:r>
+      <w:r>
+        <w:rPr>
+          <w:rStyle w:val="VerbatimChar"/>
+        </w:rPr>
+        <w:t xml:space="preserve">/my-health</w:t>
+      </w:r>
+      <w:r>
+        <w:t xml:space="preserve"> </w:t>
+      </w:r>
+      <w:r>
+        <w:t xml:space="preserve">with dedicated views per record type.</w:t>
+      </w:r>
+    </w:p>
+    <w:p>
+      <w:pPr>
+        <w:pStyle w:val="BodyText"/>
+      </w:pPr>
+      <w:r>
+        <w:rPr>
+          <w:b/>
+        </w:rPr>
+        <w:t xml:space="preserve">System Importance:</w:t>
+      </w:r>
+      <w:r>
+        <w:t xml:space="preserve"> </w:t>
+      </w:r>
+      <w:r>
+        <w:t xml:space="preserve">This is the platform’s answer to the 21st Century Cures Act Information Blocking Rule, which requires patients have electronic access to their health information. It is the authorized community-to-clinical read path, surfacing clinician-owned data to the patient through FHIR services without exposing the underlying clinical tables.</w:t>
+      </w:r>
+    </w:p>
+    <w:p>
+      <w:pPr>
+        <w:pStyle w:val="BodyText"/>
+      </w:pPr>
+      <w:r>
+        <w:rPr>
+          <w:b/>
+        </w:rPr>
+        <w:t xml:space="preserve">Uniqueness:</w:t>
+      </w:r>
+      <w:r>
+        <w:t xml:space="preserve"> </w:t>
+      </w:r>
+      <w:r>
+        <w:t xml:space="preserve">Most patient portals are bolt-on afterthoughts with clunky PDF dumps. My Health Hub is built into the senior-friendly WellFit UI — large text, plain language, voice-enabled — so the same interface that collects daily check-ins also returns the patient’s complete record in a form they can actually read.</w:t>
+      </w:r>
+    </w:p>
+    <w:p>
+      <w:pPr>
+        <w:pStyle w:val="BodyText"/>
+      </w:pPr>
+      <w:r>
+        <w:rPr>
+          <w:b/>
+        </w:rPr>
+        <w:t xml:space="preserve">Latent Benefit:</w:t>
+      </w:r>
+      <w:r>
+        <w:t xml:space="preserve"> </w:t>
+      </w:r>
+      <w:r>
+        <w:t xml:space="preserve">Cures Act compliance is a regulatory requirement most small facilities cannot afford to build. Shipping it as a standard feature turns a compliance liability into a competitive differentiator, and the export pipeline doubles as the records-release mechanism for care transitions.</w:t>
+      </w:r>
+    </w:p>
+    <w:p>
+      <w:r>
+        <w:pict>
+          <v:rect style="width:0;height:1.5pt" o:hralign="center" o:hrstd="t" o:hr="t"/>
+        </w:pict>
+      </w:r>
+    </w:p>
+    <w:p>
+      <w:pPr>
+        <w:pStyle w:val="Heading3"/>
+      </w:pPr>
+      <w:bookmarkStart w:id="88" w:name="X07f23de29381db689f34dd870fab866768b2606"/>
+      <w:r>
+        <w:t xml:space="preserve">Feature 62: Specialty Clinical Module Suite (8 Modules)</w:t>
+      </w:r>
+      <w:bookmarkEnd w:id="88"/>
+    </w:p>
+    <w:p>
+      <w:pPr>
+        <w:pStyle w:val="FirstParagraph"/>
+      </w:pPr>
+      <w:r>
+        <w:rPr>
+          <w:b/>
+        </w:rPr>
+        <w:t xml:space="preserve">Primary Function:</w:t>
+      </w:r>
+      <w:r>
+        <w:t xml:space="preserve"> </w:t>
+      </w:r>
+      <w:r>
+        <w:t xml:space="preserve">Eight specialty-specific clinical dashboards — Cardiology (ECG, echo, heart-failure, cardiac rehab, device monitoring), Oncology (cancer registry, TNM staging, chemo/radiation, CTCAE, survivorship), Labor &amp; Delivery (prenatal, labor tracking, fetal monitoring, postpartum), Neuro/Stroke (NIHSS severity assessment), Memory Clinic (cognitive decline tracking), Physical Therapy (treatment plans, mobility outcomes), Dental Health, and Mental Health.</w:t>
+      </w:r>
+    </w:p>
+    <w:p>
+      <w:pPr>
+        <w:pStyle w:val="BodyText"/>
+      </w:pPr>
+      <w:r>
+        <w:rPr>
+          <w:b/>
+        </w:rPr>
+        <w:t xml:space="preserve">System Importance:</w:t>
+      </w:r>
+      <w:r>
+        <w:t xml:space="preserve"> </w:t>
+      </w:r>
+      <w:r>
+        <w:t xml:space="preserve">These modules extend the clinical engine from general care into specialty workflows, each with its own assessment instruments and documentation. They are individually feature-flagged so a facility enables only the specialties it offers.</w:t>
+      </w:r>
+    </w:p>
+    <w:p>
+      <w:pPr>
+        <w:pStyle w:val="BodyText"/>
+      </w:pPr>
+      <w:r>
+        <w:rPr>
+          <w:b/>
+        </w:rPr>
+        <w:t xml:space="preserve">Uniqueness:</w:t>
+      </w:r>
+      <w:r>
+        <w:t xml:space="preserve"> </w:t>
+      </w:r>
+      <w:r>
+        <w:t xml:space="preserve">A platform built by a superintendent and a nurse covering eight clinical specialties — each with the correct standardized instruments (TNM, NIHSS, CTCAE, Morse) rather than generic note fields — is a scope most commercial EHR specialty modules charge separately for.</w:t>
+      </w:r>
+    </w:p>
+    <w:p>
+      <w:pPr>
+        <w:pStyle w:val="BodyText"/>
+      </w:pPr>
+      <w:r>
+        <w:rPr>
+          <w:b/>
+        </w:rPr>
+        <w:t xml:space="preserve">Latent Benefit:</w:t>
+      </w:r>
+      <w:r>
+        <w:t xml:space="preserve"> </w:t>
+      </w:r>
+      <w:r>
+        <w:t xml:space="preserve">Each specialty module captures structured, codeable data (staging, severity scores) that flows directly into the billing and quality-measure engines, so specialty documentation becomes specialty revenue without a second data-entry pass.</w:t>
+      </w:r>
+    </w:p>
+    <w:p>
+      <w:r>
+        <w:pict>
+          <v:rect style="width:0;height:1.5pt" o:hralign="center" o:hrstd="t" o:hr="t"/>
+        </w:pict>
+      </w:r>
+    </w:p>
+    <w:p>
+      <w:pPr>
+        <w:pStyle w:val="Heading3"/>
+      </w:pPr>
+      <w:bookmarkStart w:id="89" w:name="X12b4cd0564501f6be3de6a5854191f90de58d42"/>
+      <w:r>
+        <w:t xml:space="preserve">Feature 63: Computerized Provider Order Entry (CPOE — ONC Certified)</w:t>
+      </w:r>
+      <w:bookmarkEnd w:id="89"/>
+    </w:p>
+    <w:p>
+      <w:pPr>
+        <w:pStyle w:val="FirstParagraph"/>
+      </w:pPr>
+      <w:r>
+        <w:rPr>
+          <w:b/>
+        </w:rPr>
+        <w:t xml:space="preserve">Primary Function:</w:t>
+      </w:r>
+      <w:r>
+        <w:t xml:space="preserve"> </w:t>
+      </w:r>
+      <w:r>
+        <w:t xml:space="preserve">Direct provider order entry for medications, lab tests, and imaging, plus implantable-device list management and family health history. Each screen maps to a specific ONC 2015 Edition Cures Update certification criterion: 170.315(a)(1) medications, (a)(2) labs, (a)(3) imaging, (a)(14) implantable devices, (a)(12) family health history.</w:t>
+      </w:r>
+    </w:p>
+    <w:p>
+      <w:pPr>
+        <w:pStyle w:val="BodyText"/>
+      </w:pPr>
+      <w:r>
+        <w:rPr>
+          <w:b/>
+        </w:rPr>
+        <w:t xml:space="preserve">System Importance:</w:t>
+      </w:r>
+      <w:r>
+        <w:t xml:space="preserve"> </w:t>
+      </w:r>
+      <w:r>
+        <w:t xml:space="preserve">CPOE is a foundational certified-EHR capability. Without it, a facility cannot attest to Promoting Interoperability and forfeits Medicare incentive payments. It is the order backbone that result escalation, billing, and the medication safety engine all build on.</w:t>
+      </w:r>
+    </w:p>
+    <w:p>
+      <w:pPr>
+        <w:pStyle w:val="BodyText"/>
+      </w:pPr>
+      <w:r>
+        <w:rPr>
+          <w:b/>
+        </w:rPr>
+        <w:t xml:space="preserve">Uniqueness:</w:t>
+      </w:r>
+      <w:r>
+        <w:t xml:space="preserve"> </w:t>
+      </w:r>
+      <w:r>
+        <w:t xml:space="preserve">Certification-grade order entry implemented to named ONC criteria — not a free-text</w:t>
+      </w:r>
+      <w:r>
+        <w:t xml:space="preserve"> </w:t>
+      </w:r>
+      <w:r>
+        <w:t xml:space="preserve">“</w:t>
+      </w:r>
+      <w:r>
+        <w:t xml:space="preserve">orders</w:t>
+      </w:r>
+      <w:r>
+        <w:t xml:space="preserve">”</w:t>
+      </w:r>
+      <w:r>
+        <w:t xml:space="preserve"> </w:t>
+      </w:r>
+      <w:r>
+        <w:t xml:space="preserve">box — in a platform built for a fraction of a commercial EHR’s cost.</w:t>
+      </w:r>
+    </w:p>
+    <w:p>
+      <w:pPr>
+        <w:pStyle w:val="BodyText"/>
+      </w:pPr>
+      <w:r>
+        <w:rPr>
+          <w:b/>
+        </w:rPr>
+        <w:t xml:space="preserve">Latent Benefit:</w:t>
+      </w:r>
+      <w:r>
+        <w:t xml:space="preserve"> </w:t>
+      </w:r>
+      <w:r>
+        <w:t xml:space="preserve">Mapping each screen to its certification criterion means the certification evidence is built into the architecture; an auditor can trace a criterion straight to a route, collapsing the usual months-long certification documentation effort.</w:t>
+      </w:r>
+    </w:p>
+    <w:p>
+      <w:r>
+        <w:pict>
+          <v:rect style="width:0;height:1.5pt" o:hralign="center" o:hrstd="t" o:hr="t"/>
+        </w:pict>
+      </w:r>
+    </w:p>
+    <w:p>
+      <w:pPr>
+        <w:pStyle w:val="Heading3"/>
+      </w:pPr>
+      <w:bookmarkStart w:id="90" w:name="Xc718b31381038c6a3a18d7b756b60e5b40302a3"/>
+      <w:r>
+        <w:t xml:space="preserve">Feature 64: AI Shift Handoff &amp; Patient Transfer System</w:t>
+      </w:r>
+      <w:bookmarkEnd w:id="90"/>
+    </w:p>
+    <w:p>
+      <w:pPr>
+        <w:pStyle w:val="FirstParagraph"/>
+      </w:pPr>
+      <w:r>
+        <w:rPr>
+          <w:b/>
+        </w:rPr>
+        <w:t xml:space="preserve">Primary Function:</w:t>
+      </w:r>
+      <w:r>
+        <w:t xml:space="preserve"> </w:t>
+      </w:r>
+      <w:r>
+        <w:t xml:space="preserve">AI-assisted nurse/physician shift handoff with auto-scored patient risks and real-time collaboration, plus an inter-facility Hospital Transfer Portal and a Receiving Dashboard for incoming patients. Generates structured handoff packets and a chronological handoff audit trail.</w:t>
+      </w:r>
+    </w:p>
+    <w:p>
+      <w:pPr>
+        <w:pStyle w:val="BodyText"/>
+      </w:pPr>
+      <w:r>
+        <w:rPr>
+          <w:b/>
+        </w:rPr>
+        <w:t xml:space="preserve">System Importance:</w:t>
+      </w:r>
+      <w:r>
+        <w:t xml:space="preserve"> </w:t>
+      </w:r>
+      <w:r>
+        <w:t xml:space="preserve">Handoffs are the highest-risk moments in care — most sentinel events trace to a communication failure at transition. This system standardizes the handoff, auto-elevates the sickest patients, and logs every transfer for accountability.</w:t>
+      </w:r>
+    </w:p>
+    <w:p>
+      <w:pPr>
+        <w:pStyle w:val="BodyText"/>
+      </w:pPr>
+      <w:r>
+        <w:rPr>
+          <w:b/>
+        </w:rPr>
+        <w:t xml:space="preserve">Uniqueness:</w:t>
+      </w:r>
+      <w:r>
+        <w:t xml:space="preserve"> </w:t>
+      </w:r>
+      <w:r>
+        <w:t xml:space="preserve">Most handoff tools are static SBAR templates. This one auto-scores patient risk from the live data stream so the handoff leads with the patients who matter, and it spans both intra-facility shift change and inter-facility transfer in one audited workflow.</w:t>
+      </w:r>
+    </w:p>
+    <w:p>
+      <w:pPr>
+        <w:pStyle w:val="BodyText"/>
+      </w:pPr>
+      <w:r>
+        <w:rPr>
+          <w:b/>
+        </w:rPr>
+        <w:t xml:space="preserve">Latent Benefit:</w:t>
+      </w:r>
+      <w:r>
+        <w:t xml:space="preserve"> </w:t>
+      </w:r>
+      <w:r>
+        <w:t xml:space="preserve">The structured handoff packet is reusable documentation — it feeds discharge summaries, care-coordination notes, and the readmission model, turning a verbal ritual into durable clinical data.</w:t>
+      </w:r>
+    </w:p>
+    <w:p>
+      <w:r>
+        <w:pict>
+          <v:rect style="width:0;height:1.5pt" o:hralign="center" o:hrstd="t" o:hr="t"/>
+        </w:pict>
+      </w:r>
+    </w:p>
+    <w:p>
+      <w:pPr>
+        <w:pStyle w:val="Heading3"/>
+      </w:pPr>
+      <w:bookmarkStart w:id="91" w:name="X581629f85b2da3b3f3e4d3058698255b190aadb"/>
+      <w:r>
+        <w:t xml:space="preserve">Feature 65: Quality Measures Dashboard (eCQM / HEDIS / MIPS / Star Ratings)</w:t>
+      </w:r>
+      <w:bookmarkEnd w:id="91"/>
+    </w:p>
+    <w:p>
+      <w:pPr>
+        <w:pStyle w:val="FirstParagraph"/>
+      </w:pPr>
+      <w:r>
+        <w:rPr>
+          <w:b/>
+        </w:rPr>
+        <w:t xml:space="preserve">Primary Function:</w:t>
+      </w:r>
+      <w:r>
+        <w:t xml:space="preserve"> </w:t>
+      </w:r>
+      <w:r>
+        <w:t xml:space="preserve">Tracks performance against electronic clinical quality measures, HEDIS, MIPS, and Medicare Star Ratings, showing gap-to-benchmark and the patients driving each measure.</w:t>
+      </w:r>
+    </w:p>
+    <w:p>
+      <w:pPr>
+        <w:pStyle w:val="BodyText"/>
+      </w:pPr>
+      <w:r>
+        <w:rPr>
+          <w:b/>
+        </w:rPr>
+        <w:t xml:space="preserve">System Importance:</w:t>
+      </w:r>
+      <w:r>
+        <w:t xml:space="preserve"> </w:t>
+      </w:r>
+      <w:r>
+        <w:t xml:space="preserve">Quality measure performance directly determines value-based reimbursement and Medicare Advantage Star bonuses. A facility that cannot measure its eCQMs cannot improve them or attest to them.</w:t>
+      </w:r>
+    </w:p>
+    <w:p>
+      <w:pPr>
+        <w:pStyle w:val="BodyText"/>
+      </w:pPr>
+      <w:r>
+        <w:rPr>
+          <w:b/>
+        </w:rPr>
+        <w:t xml:space="preserve">Uniqueness:</w:t>
+      </w:r>
+      <w:r>
+        <w:t xml:space="preserve"> </w:t>
+      </w:r>
+      <w:r>
+        <w:t xml:space="preserve">Quality measurement is usually a separate, expensive analytics product. Here it reads the same encounter and check-in data the rest of the platform already captures, so the measures are live rather than a quarterly retrospective.</w:t>
+      </w:r>
+    </w:p>
+    <w:p>
+      <w:pPr>
+        <w:pStyle w:val="BodyText"/>
+      </w:pPr>
+      <w:r>
+        <w:rPr>
+          <w:b/>
+        </w:rPr>
+        <w:t xml:space="preserve">Latent Benefit:</w:t>
+      </w:r>
+      <w:r>
+        <w:t xml:space="preserve"> </w:t>
+      </w:r>
+      <w:r>
+        <w:t xml:space="preserve">Because the measures are computed continuously, the dashboard surfaces a closeable gap while the patient is still in care — converting quality reporting from a backward-looking scorecard into a forward-looking revenue and outcomes tool.</w:t>
+      </w:r>
+    </w:p>
+    <w:p>
+      <w:r>
+        <w:pict>
+          <v:rect style="width:0;height:1.5pt" o:hralign="center" o:hrstd="t" o:hr="t"/>
+        </w:pict>
+      </w:r>
+    </w:p>
+    <w:p>
+      <w:pPr>
+        <w:pStyle w:val="Heading3"/>
+      </w:pPr>
+      <w:bookmarkStart w:id="92" w:name="Xea1dc41214398ac3011a3dd05384b30da5a801f"/>
+      <w:r>
+        <w:t xml:space="preserve">Feature 66: CCM Autopilot — Chronic Care Management Time Capture</w:t>
+      </w:r>
+      <w:bookmarkEnd w:id="92"/>
+    </w:p>
+    <w:p>
+      <w:pPr>
+        <w:pStyle w:val="FirstParagraph"/>
+      </w:pPr>
+      <w:r>
+        <w:rPr>
+          <w:b/>
+        </w:rPr>
+        <w:t xml:space="preserve">Primary Function:</w:t>
+      </w:r>
+      <w:r>
+        <w:t xml:space="preserve"> </w:t>
+      </w:r>
+      <w:r>
+        <w:t xml:space="preserve">Automatically tracks the 20+ minutes of non-face-to-face care coordination per month required to bill Chronic Care Management codes, assembling the time log and documentation needed for the claim.</w:t>
+      </w:r>
+    </w:p>
+    <w:p>
+      <w:pPr>
+        <w:pStyle w:val="BodyText"/>
+      </w:pPr>
+      <w:r>
+        <w:rPr>
+          <w:b/>
+        </w:rPr>
+        <w:t xml:space="preserve">System Importance:</w:t>
+      </w:r>
+      <w:r>
+        <w:t xml:space="preserve"> </w:t>
+      </w:r>
+      <w:r>
+        <w:t xml:space="preserve">CCM is one of the most under-captured revenue streams in primary care because the time tracking is manual and clinicians forget to log it. Autopilot removes the manual step.</w:t>
+      </w:r>
+    </w:p>
+    <w:p>
+      <w:pPr>
+        <w:pStyle w:val="BodyText"/>
+      </w:pPr>
+      <w:r>
+        <w:rPr>
+          <w:b/>
+        </w:rPr>
+        <w:t xml:space="preserve">Uniqueness:</w:t>
+      </w:r>
+      <w:r>
+        <w:t xml:space="preserve"> </w:t>
+      </w:r>
+      <w:r>
+        <w:t xml:space="preserve">Rather than a stopwatch the nurse must remember to start, it infers billable coordination time from actual system activity against the patient, so the documentation accrues passively.</w:t>
+      </w:r>
+    </w:p>
+    <w:p>
+      <w:pPr>
+        <w:pStyle w:val="BodyText"/>
+      </w:pPr>
+      <w:r>
+        <w:rPr>
+          <w:b/>
+        </w:rPr>
+        <w:t xml:space="preserve">Latent Benefit:</w:t>
+      </w:r>
+      <w:r>
+        <w:t xml:space="preserve"> </w:t>
+      </w:r>
+      <w:r>
+        <w:t xml:space="preserve">At $42–$74 per 20-minute interaction across a chronic-disease panel, automated CCM capture can fund the platform itself — revenue that existed but was being left uncollected.</w:t>
+      </w:r>
+    </w:p>
+    <w:p>
+      <w:r>
+        <w:pict>
+          <v:rect style="width:0;height:1.5pt" o:hralign="center" o:hrstd="t" o:hr="t"/>
+        </w:pict>
+      </w:r>
+    </w:p>
+    <w:p>
+      <w:pPr>
+        <w:pStyle w:val="Heading3"/>
+      </w:pPr>
+      <w:bookmarkStart w:id="93" w:name="X90238d568671fd1b59cc4ef05d4564d43364e53"/>
+      <w:r>
+        <w:t xml:space="preserve">Feature 67: Result Escalation Engine &amp; Care Gap Detection</w:t>
+      </w:r>
+      <w:bookmarkEnd w:id="93"/>
+    </w:p>
+    <w:p>
+      <w:pPr>
+        <w:pStyle w:val="FirstParagraph"/>
+      </w:pPr>
+      <w:r>
+        <w:rPr>
+          <w:b/>
+        </w:rPr>
+        <w:t xml:space="preserve">Primary Function:</w:t>
+      </w:r>
+      <w:r>
+        <w:t xml:space="preserve"> </w:t>
+      </w:r>
+      <w:r>
+        <w:t xml:space="preserve">Auto-routes abnormal lab and imaging results to the correct specialist with SLA deadlines, tracks unacknowledged results, manages a provider task queue with escalation, and detects open preventive-care gaps across the patient panel.</w:t>
+      </w:r>
+    </w:p>
+    <w:p>
+      <w:pPr>
+        <w:pStyle w:val="BodyText"/>
+      </w:pPr>
+      <w:r>
+        <w:rPr>
+          <w:b/>
+        </w:rPr>
+        <w:t xml:space="preserve">System Importance:</w:t>
+      </w:r>
+      <w:r>
+        <w:t xml:space="preserve"> </w:t>
+      </w:r>
+      <w:r>
+        <w:t xml:space="preserve">A critical result that no one acknowledges is a patient-safety and malpractice event. This engine guarantees every abnormal value has an owner, a deadline, and an audit trail.</w:t>
+      </w:r>
+    </w:p>
+    <w:p>
+      <w:pPr>
+        <w:pStyle w:val="BodyText"/>
+      </w:pPr>
+      <w:r>
+        <w:rPr>
+          <w:b/>
+        </w:rPr>
+        <w:t xml:space="preserve">Uniqueness:</w:t>
+      </w:r>
+      <w:r>
+        <w:t xml:space="preserve"> </w:t>
+      </w:r>
+      <w:r>
+        <w:t xml:space="preserve">Most systems drop results into an inbox and hope someone looks. This one enforces accountability with SLA timers, automatic escalation when a deadline passes, and coverage-aware routing when a provider is on leave.</w:t>
+      </w:r>
+    </w:p>
+    <w:p>
+      <w:pPr>
+        <w:pStyle w:val="BodyText"/>
+      </w:pPr>
+      <w:r>
+        <w:rPr>
+          <w:b/>
+        </w:rPr>
+        <w:t xml:space="preserve">Latent Benefit:</w:t>
+      </w:r>
+      <w:r>
+        <w:t xml:space="preserve"> </w:t>
+      </w:r>
+      <w:r>
+        <w:t xml:space="preserve">The same routing logic that protects patients also closes care gaps that carry quality and risk-adjustment dollars, so the safety system and the revenue system are one engine.</w:t>
+      </w:r>
+    </w:p>
+    <w:p>
+      <w:r>
+        <w:pict>
+          <v:rect style="width:0;height:1.5pt" o:hralign="center" o:hrstd="t" o:hr="t"/>
+        </w:pict>
+      </w:r>
+    </w:p>
+    <w:p>
+      <w:pPr>
+        <w:pStyle w:val="Heading3"/>
+      </w:pPr>
+      <w:bookmarkStart w:id="94" w:name="Xdb25f0caf39f86389fc19ecd6598ce03ddb3c44"/>
+      <w:r>
+        <w:t xml:space="preserve">Feature 68: Clinician Remote Patient Monitoring (RPM) Dashboard</w:t>
+      </w:r>
+      <w:bookmarkEnd w:id="94"/>
+    </w:p>
+    <w:p>
+      <w:pPr>
+        <w:pStyle w:val="FirstParagraph"/>
+      </w:pPr>
+      <w:r>
+        <w:rPr>
+          <w:b/>
+        </w:rPr>
+        <w:t xml:space="preserve">Primary Function:</w:t>
+      </w:r>
+      <w:r>
+        <w:t xml:space="preserve"> </w:t>
+      </w:r>
+      <w:r>
+        <w:t xml:space="preserve">A clinician-facing oversight view of home-collected readings (blood pressure, heart rate, glucose, weight, SpO2) from check-ins and connected devices, with threshold alerting when a home value goes out of range.</w:t>
+      </w:r>
+    </w:p>
+    <w:p>
+      <w:pPr>
+        <w:pStyle w:val="BodyText"/>
+      </w:pPr>
+      <w:r>
+        <w:rPr>
+          <w:b/>
+        </w:rPr>
+        <w:t xml:space="preserve">System Importance:</w:t>
+      </w:r>
+      <w:r>
+        <w:t xml:space="preserve"> </w:t>
+      </w:r>
+      <w:r>
+        <w:t xml:space="preserve">This closes the loop on the platform’s data collection — home vitals are only valuable clinically if a clinician sees them and can act. The RPM dashboard makes the community-side data stream actionable on the clinical side.</w:t>
+      </w:r>
+    </w:p>
+    <w:p>
+      <w:pPr>
+        <w:pStyle w:val="BodyText"/>
+      </w:pPr>
+      <w:r>
+        <w:rPr>
+          <w:b/>
+        </w:rPr>
+        <w:t xml:space="preserve">Uniqueness:</w:t>
+      </w:r>
+      <w:r>
+        <w:t xml:space="preserve"> </w:t>
+      </w:r>
+      <w:r>
+        <w:t xml:space="preserve">It unifies manually-entered check-in vitals and connected-device readings into one trend view, rather than siloing</w:t>
+      </w:r>
+      <w:r>
+        <w:t xml:space="preserve"> </w:t>
+      </w:r>
+      <w:r>
+        <w:t xml:space="preserve">“</w:t>
+      </w:r>
+      <w:r>
+        <w:t xml:space="preserve">app data</w:t>
+      </w:r>
+      <w:r>
+        <w:t xml:space="preserve">”</w:t>
+      </w:r>
+      <w:r>
+        <w:t xml:space="preserve"> </w:t>
+      </w:r>
+      <w:r>
+        <w:t xml:space="preserve">from</w:t>
+      </w:r>
+      <w:r>
+        <w:t xml:space="preserve"> </w:t>
+      </w:r>
+      <w:r>
+        <w:t xml:space="preserve">“</w:t>
+      </w:r>
+      <w:r>
+        <w:t xml:space="preserve">device data,</w:t>
+      </w:r>
+      <w:r>
+        <w:t xml:space="preserve">”</w:t>
+      </w:r>
+      <w:r>
+        <w:t xml:space="preserve"> </w:t>
+      </w:r>
+      <w:r>
+        <w:t xml:space="preserve">and it is the clinician counterpart to the patient-facing wearables suite.</w:t>
+      </w:r>
+    </w:p>
+    <w:p>
+      <w:pPr>
+        <w:pStyle w:val="BodyText"/>
+      </w:pPr>
+      <w:r>
+        <w:rPr>
+          <w:b/>
+        </w:rPr>
+        <w:t xml:space="preserve">Latent Benefit:</w:t>
+      </w:r>
+      <w:r>
+        <w:t xml:space="preserve"> </w:t>
+      </w:r>
+      <w:r>
+        <w:t xml:space="preserve">The dashboard supplies the clinician-review documentation required for the RPM treatment-management codes (CPT 99457/99458), converting passive monitoring into a billable monthly service.</w:t>
+      </w:r>
+    </w:p>
+    <w:p>
+      <w:r>
+        <w:pict>
+          <v:rect style="width:0;height:1.5pt" o:hralign="center" o:hrstd="t" o:hr="t"/>
+        </w:pict>
+      </w:r>
+    </w:p>
+    <w:p>
+      <w:pPr>
+        <w:pStyle w:val="Heading3"/>
+      </w:pPr>
+      <w:bookmarkStart w:id="95" w:name="X476429110dc651a369d81c5a3f94b6ac0b538d0"/>
+      <w:r>
+        <w:t xml:space="preserve">Feature 69: MCP Server Suite &amp; Management (20 Model Context Protocol Servers)</w:t>
+      </w:r>
+      <w:bookmarkEnd w:id="95"/>
+    </w:p>
+    <w:p>
+      <w:pPr>
+        <w:pStyle w:val="FirstParagraph"/>
+      </w:pPr>
+      <w:r>
+        <w:rPr>
+          <w:b/>
+        </w:rPr>
+        <w:t xml:space="preserve">Primary Function:</w:t>
+      </w:r>
+      <w:r>
+        <w:t xml:space="preserve"> </w:t>
+      </w:r>
+      <w:r>
+        <w:t xml:space="preserve">Twenty Model Context Protocol servers give AI agents safe, tiered access to clinical and reference systems — FHIR, HL7/X12, prior auth, CMS coverage, NPI registry, medical codes, DRG grouping, PubMed, patient context, cultural competency, and more — managed from a console that monitors health, rotates API keys, orchestrates multi-server chains, and tracks per-run cost.</w:t>
+      </w:r>
+    </w:p>
+    <w:p>
+      <w:pPr>
+        <w:pStyle w:val="BodyText"/>
+      </w:pPr>
+      <w:r>
+        <w:rPr>
+          <w:b/>
+        </w:rPr>
+        <w:t xml:space="preserve">System Importance:</w:t>
+      </w:r>
+      <w:r>
+        <w:t xml:space="preserve"> </w:t>
+      </w:r>
+      <w:r>
+        <w:t xml:space="preserve">The MCP layer is the platform’s AI-tooling backbone. It is what lets AI features compose real clinical operations (look up coverage, validate an NPI, group a DRG) instead of hallucinating them, with permission tiers that keep PHI access scoped and audited.</w:t>
+      </w:r>
+    </w:p>
+    <w:p>
+      <w:pPr>
+        <w:pStyle w:val="BodyText"/>
+      </w:pPr>
+      <w:r>
+        <w:rPr>
+          <w:b/>
+        </w:rPr>
+        <w:t xml:space="preserve">Uniqueness:</w:t>
+      </w:r>
+      <w:r>
+        <w:t xml:space="preserve"> </w:t>
+      </w:r>
+      <w:r>
+        <w:t xml:space="preserve">Protocol-level governance — runtime permission tiers and a learning loop built into the MCP servers themselves — is a novel composition, not an off-the-shelf pattern. Each server declares its tier (external-API, user-scoped, or admin) and is enforced at the protocol boundary.</w:t>
+      </w:r>
+    </w:p>
+    <w:p>
+      <w:pPr>
+        <w:pStyle w:val="BodyText"/>
+      </w:pPr>
+      <w:r>
+        <w:rPr>
+          <w:b/>
+        </w:rPr>
+        <w:t xml:space="preserve">Latent Benefit:</w:t>
+      </w:r>
+      <w:r>
+        <w:t xml:space="preserve"> </w:t>
+      </w:r>
+      <w:r>
+        <w:t xml:space="preserve">Because every AI capability is a discrete, individually-permissioned, cost-metered server, the platform can expose or restrict AI functions per tenant and bill AI usage precisely — turning the AI layer into a governable, sellable product surface.</w:t>
+      </w:r>
+    </w:p>
+    <w:p>
+      <w:r>
+        <w:pict>
+          <v:rect style="width:0;height:1.5pt" o:hralign="center" o:hrstd="t" o:hr="t"/>
+        </w:pict>
+      </w:r>
+    </w:p>
+    <w:p>
+      <w:pPr>
+        <w:pStyle w:val="Heading3"/>
+      </w:pPr>
+      <w:bookmarkStart w:id="96" w:name="Xfee3480f685cbe4b0a2becb5b5c5cc88f737e69"/>
+      <w:r>
+        <w:t xml:space="preserve">Feature 70: Revenue Cycle Completion Suite</w:t>
+      </w:r>
+      <w:bookmarkEnd w:id="96"/>
+    </w:p>
+    <w:p>
+      <w:pPr>
+        <w:pStyle w:val="FirstParagraph"/>
+      </w:pPr>
+      <w:r>
+        <w:rPr>
+          <w:b/>
+        </w:rPr>
+        <w:t xml:space="preserve">Primary Function:</w:t>
+      </w:r>
+      <w:r>
+        <w:t xml:space="preserve"> </w:t>
+      </w:r>
+      <w:r>
+        <w:t xml:space="preserve">The remaining revenue-cycle stages beyond claim generation — insurance eligibility verification (270/271) before billing, ERA/835 remittance posting, claim aging by bucket, claim resubmission and void workflows, superbill provider sign-off, and NPI-verified provider registry.</w:t>
+      </w:r>
+    </w:p>
+    <w:p>
+      <w:pPr>
+        <w:pStyle w:val="BodyText"/>
+      </w:pPr>
+      <w:r>
+        <w:rPr>
+          <w:b/>
+        </w:rPr>
+        <w:t xml:space="preserve">System Importance:</w:t>
+      </w:r>
+      <w:r>
+        <w:t xml:space="preserve"> </w:t>
+      </w:r>
+      <w:r>
+        <w:t xml:space="preserve">A claim is only revenue when it is paid. These stages close the loop from eligibility check through payment posting, catching denials before submission and reconciling payments after.</w:t>
+      </w:r>
+    </w:p>
+    <w:p>
+      <w:pPr>
+        <w:pStyle w:val="BodyText"/>
+      </w:pPr>
+      <w:r>
+        <w:rPr>
+          <w:b/>
+        </w:rPr>
+        <w:t xml:space="preserve">Uniqueness:</w:t>
+      </w:r>
+      <w:r>
+        <w:t xml:space="preserve"> </w:t>
+      </w:r>
+      <w:r>
+        <w:t xml:space="preserve">Small facilities usually stitch this together from a clearinghouse portal plus spreadsheets. Here the full lifecycle — eligibility, submission, aging, resubmission, posting — lives in one system with the clinical data that justifies each charge.</w:t>
+      </w:r>
+    </w:p>
+    <w:p>
+      <w:pPr>
+        <w:pStyle w:val="BodyText"/>
+      </w:pPr>
+      <w:r>
+        <w:rPr>
+          <w:b/>
+        </w:rPr>
+        <w:t xml:space="preserve">Latent Benefit:</w:t>
+      </w:r>
+      <w:r>
+        <w:t xml:space="preserve"> </w:t>
+      </w:r>
+      <w:r>
+        <w:t xml:space="preserve">Front-loading eligibility verification prevents the most common denial category outright, and automated ERA posting eliminates the manual reconciliation that consumes most billing-staff hours.</w:t>
+      </w:r>
+    </w:p>
+    <w:p>
+      <w:r>
+        <w:pict>
+          <v:rect style="width:0;height:1.5pt" o:hralign="center" o:hrstd="t" o:hr="t"/>
+        </w:pict>
+      </w:r>
+    </w:p>
+    <w:p>
+      <w:pPr>
+        <w:pStyle w:val="Heading3"/>
+      </w:pPr>
+      <w:bookmarkStart w:id="97" w:name="X22364ccc1b596fdc80cc59f8bd2a4b8902dde5c"/>
+      <w:r>
+        <w:t xml:space="preserve">Feature 71: HIPAA Compliance Operations Suite</w:t>
+      </w:r>
+      <w:bookmarkEnd w:id="97"/>
+    </w:p>
+    <w:p>
+      <w:pPr>
+        <w:pStyle w:val="FirstParagraph"/>
+      </w:pPr>
+      <w:r>
+        <w:rPr>
+          <w:b/>
+        </w:rPr>
+        <w:t xml:space="preserve">Primary Function:</w:t>
+      </w:r>
+      <w:r>
+        <w:t xml:space="preserve"> </w:t>
+      </w:r>
+      <w:r>
+        <w:t xml:space="preserve">Operational HIPAA tooling beyond the SOC2 dashboards — a Breach Notification Engine (incident tracking, risk assessment, 60-day notification clock), BAA lifecycle tracking, MFA enrollment compliance, workforce security-awareness training tracking, and the patient amendment review queue (45 CFR 164.526).</w:t>
+      </w:r>
+    </w:p>
+    <w:p>
+      <w:pPr>
+        <w:pStyle w:val="BodyText"/>
+      </w:pPr>
+      <w:r>
+        <w:rPr>
+          <w:b/>
+        </w:rPr>
+        <w:t xml:space="preserve">System Importance:</w:t>
+      </w:r>
+      <w:r>
+        <w:t xml:space="preserve"> </w:t>
+      </w:r>
+      <w:r>
+        <w:t xml:space="preserve">These are the day-to-day compliance obligations an auditor checks: did you track breaches, manage your business-associate agreements, enroll staff in MFA, train your workforce, and honor amendment requests. Missing any one is a finding.</w:t>
+      </w:r>
+    </w:p>
+    <w:p>
+      <w:pPr>
+        <w:pStyle w:val="BodyText"/>
+      </w:pPr>
+      <w:r>
+        <w:rPr>
+          <w:b/>
+        </w:rPr>
+        <w:t xml:space="preserve">Uniqueness:</w:t>
+      </w:r>
+      <w:r>
+        <w:t xml:space="preserve"> </w:t>
+      </w:r>
+      <w:r>
+        <w:t xml:space="preserve">Compliance is usually a binder of policies. This suite makes each obligation a live, dated workflow with its own clock and audit trail, so compliance status is queryable rather than aspirational.</w:t>
+      </w:r>
+    </w:p>
+    <w:p>
+      <w:pPr>
+        <w:pStyle w:val="BodyText"/>
+      </w:pPr>
+      <w:r>
+        <w:rPr>
+          <w:b/>
+        </w:rPr>
+        <w:t xml:space="preserve">Latent Benefit:</w:t>
+      </w:r>
+      <w:r>
+        <w:t xml:space="preserve"> </w:t>
+      </w:r>
+      <w:r>
+        <w:t xml:space="preserve">The 60-day breach clock and BAA renewal tracking convert two of the most common (and most penalized) compliance failures into automated reminders, materially lowering both audit risk and breach-penalty exposure.</w:t>
+      </w:r>
+    </w:p>
+    <w:p>
+      <w:r>
+        <w:pict>
+          <v:rect style="width:0;height:1.5pt" o:hralign="center" o:hrstd="t" o:hr="t"/>
+        </w:pict>
+      </w:r>
+    </w:p>
+    <w:p>
+      <w:pPr>
+        <w:pStyle w:val="Heading3"/>
+      </w:pPr>
+      <w:bookmarkStart w:id="98" w:name="Xb36bd2b893441d0796e85e11a3c2240913380c9"/>
+      <w:r>
+        <w:t xml:space="preserve">Feature 72: DSI Transparency &amp; EHR Safety (HTI-1 Model Cards + SAFER Guides)</w:t>
+      </w:r>
+      <w:bookmarkEnd w:id="98"/>
+    </w:p>
+    <w:p>
+      <w:pPr>
+        <w:pStyle w:val="FirstParagraph"/>
+      </w:pPr>
+      <w:r>
+        <w:rPr>
+          <w:b/>
+        </w:rPr>
+        <w:t xml:space="preserve">Primary Function:</w:t>
+      </w:r>
+      <w:r>
+        <w:t xml:space="preserve"> </w:t>
+      </w:r>
+      <w:r>
+        <w:t xml:space="preserve">AI/ML model cards documenting each algorithm’s purpose, risk classification, and transparency attributes (ONC HTI-1 Decision Support Intervention requirements), plus the SAFER Guides EHR safety self-assessment used in ONC certification.</w:t>
+      </w:r>
+    </w:p>
+    <w:p>
+      <w:pPr>
+        <w:pStyle w:val="BodyText"/>
+      </w:pPr>
+      <w:r>
+        <w:rPr>
+          <w:b/>
+        </w:rPr>
+        <w:t xml:space="preserve">System Importance:</w:t>
+      </w:r>
+      <w:r>
+        <w:t xml:space="preserve"> </w:t>
+      </w:r>
+      <w:r>
+        <w:t xml:space="preserve">Under HTI-1, any predictive decision-support intervention must be transparent — described, risk-classified, and disclosed. The model-card registry is how the platform meets that bar for its clinical AI, and SAFER Guides documents the safe-use practices certification requires.</w:t>
+      </w:r>
+    </w:p>
+    <w:p>
+      <w:pPr>
+        <w:pStyle w:val="BodyText"/>
+      </w:pPr>
+      <w:r>
+        <w:rPr>
+          <w:b/>
+        </w:rPr>
+        <w:t xml:space="preserve">Uniqueness:</w:t>
+      </w:r>
+      <w:r>
+        <w:t xml:space="preserve"> </w:t>
+      </w:r>
+      <w:r>
+        <w:t xml:space="preserve">Most AI health tools ship the model and skip the transparency. Here every registered AI skill carries both a developer description and a plain-language patient description, and the model-card dashboard exposes them for audit — transparency as a built-in feature, not a PDF afterthought.</w:t>
+      </w:r>
+    </w:p>
+    <w:p>
+      <w:pPr>
+        <w:pStyle w:val="BodyText"/>
+      </w:pPr>
+      <w:r>
+        <w:rPr>
+          <w:b/>
+        </w:rPr>
+        <w:t xml:space="preserve">Latent Benefit:</w:t>
+      </w:r>
+      <w:r>
+        <w:t xml:space="preserve"> </w:t>
+      </w:r>
+      <w:r>
+        <w:t xml:space="preserve">As DSI transparency enforcement tightens, facilities using opaque AI face exposure. A platform that already documents and risk-classifies every model is audit-ready by default and can truthfully market algorithmic transparency.</w:t>
+      </w:r>
+    </w:p>
+    <w:p>
+      <w:r>
+        <w:pict>
+          <v:rect style="width:0;height:1.5pt" o:hralign="center" o:hrstd="t" o:hr="t"/>
+        </w:pict>
+      </w:r>
+    </w:p>
+    <w:p>
+      <w:pPr>
+        <w:pStyle w:val="Heading3"/>
+      </w:pPr>
+      <w:bookmarkStart w:id="99" w:name="feature-73-staff-resilience-wellness-hub"/>
+      <w:r>
+        <w:t xml:space="preserve">Feature 73: Staff Resilience &amp; Wellness Hub</w:t>
+      </w:r>
+      <w:bookmarkEnd w:id="99"/>
+    </w:p>
+    <w:p>
+      <w:pPr>
+        <w:pStyle w:val="FirstParagraph"/>
+      </w:pPr>
+      <w:r>
+        <w:rPr>
+          <w:b/>
+        </w:rPr>
+        <w:t xml:space="preserve">Primary Function:</w:t>
+      </w:r>
+      <w:r>
+        <w:t xml:space="preserve"> </w:t>
+      </w:r>
+      <w:r>
+        <w:t xml:space="preserve">Burnout-prevention and emotional-resilience tooling for clinical staff — a Nurse Wellness (Resilience Hub) dashboard, a staff wellness dashboard, and exportable team wellness reports.</w:t>
+      </w:r>
+    </w:p>
+    <w:p>
+      <w:pPr>
+        <w:pStyle w:val="BodyText"/>
+      </w:pPr>
+      <w:r>
+        <w:rPr>
+          <w:b/>
+        </w:rPr>
+        <w:t xml:space="preserve">System Importance:</w:t>
+      </w:r>
+      <w:r>
+        <w:t xml:space="preserve"> </w:t>
+      </w:r>
+      <w:r>
+        <w:t xml:space="preserve">Clinician burnout is the leading driver of turnover and a documented patient-safety risk. Supporting staff wellbeing is both a retention strategy and a quality strategy.</w:t>
+      </w:r>
+    </w:p>
+    <w:p>
+      <w:pPr>
+        <w:pStyle w:val="BodyText"/>
+      </w:pPr>
+      <w:r>
+        <w:rPr>
+          <w:b/>
+        </w:rPr>
+        <w:t xml:space="preserve">Uniqueness:</w:t>
+      </w:r>
+      <w:r>
+        <w:t xml:space="preserve"> </w:t>
+      </w:r>
+      <w:r>
+        <w:t xml:space="preserve">Most health platforms optimize for patient throughput and ignore the workforce entirely. Building wellness tooling for the staff — by a team that includes a 23-year RN — reflects a clinician’s understanding that you cannot run a safe unit on an exhausted one.</w:t>
+      </w:r>
+    </w:p>
+    <w:p>
+      <w:pPr>
+        <w:pStyle w:val="BodyText"/>
+      </w:pPr>
+      <w:r>
+        <w:rPr>
+          <w:b/>
+        </w:rPr>
+        <w:t xml:space="preserve">Latent Benefit:</w:t>
+      </w:r>
+      <w:r>
+        <w:t xml:space="preserve"> </w:t>
+      </w:r>
+      <w:r>
+        <w:t xml:space="preserve">Reducing turnover avoids the six-figure cost of replacing a specialized nurse, and the wellness reports give administrators an early-warning signal for unit-level burnout before it becomes a staffing crisis.</w:t>
+      </w:r>
+    </w:p>
+    <w:p>
+      <w:r>
+        <w:pict>
+          <v:rect style="width:0;height:1.5pt" o:hralign="center" o:hrstd="t" o:hr="t"/>
+        </w:pict>
+      </w:r>
+    </w:p>
+    <w:p>
+      <w:pPr>
+        <w:pStyle w:val="Heading3"/>
+      </w:pPr>
+      <w:bookmarkStart w:id="100" w:name="X675b2d443d156c71ece32f0e36ce83b94d7ba9a"/>
+      <w:r>
+        <w:t xml:space="preserve">Feature 74: EMS Coordinated Response &amp; Field Integration</w:t>
+      </w:r>
+      <w:bookmarkEnd w:id="100"/>
+    </w:p>
+    <w:p>
+      <w:pPr>
+        <w:pStyle w:val="FirstParagraph"/>
+      </w:pPr>
+      <w:r>
+        <w:rPr>
+          <w:b/>
+        </w:rPr>
+        <w:t xml:space="preserve">Primary Function:</w:t>
+      </w:r>
+      <w:r>
+        <w:t xml:space="preserve"> </w:t>
+      </w:r>
+      <w:r>
+        <w:t xml:space="preserve">Coordinates emergency response between EMS crews and the clinical team — EMS metrics, paramedic handoff, and a coordinated-response dashboard that links a field handoff to the receiving clinical team.</w:t>
+      </w:r>
+    </w:p>
+    <w:p>
+      <w:pPr>
+        <w:pStyle w:val="BodyText"/>
+      </w:pPr>
+      <w:r>
+        <w:rPr>
+          <w:b/>
+        </w:rPr>
+        <w:t xml:space="preserve">System Importance:</w:t>
+      </w:r>
+      <w:r>
+        <w:t xml:space="preserve"> </w:t>
+      </w:r>
+      <w:r>
+        <w:t xml:space="preserve">The prehospital-to-hospital handoff is a notorious information gap. Tying EMS field data to the clinical record before the patient arrives gives the receiving team a head start on the sickest patients.</w:t>
+      </w:r>
+    </w:p>
+    <w:p>
+      <w:pPr>
+        <w:pStyle w:val="BodyText"/>
+      </w:pPr>
+      <w:r>
+        <w:rPr>
+          <w:b/>
+        </w:rPr>
+        <w:t xml:space="preserve">Uniqueness:</w:t>
+      </w:r>
+      <w:r>
+        <w:t xml:space="preserve"> </w:t>
+      </w:r>
+      <w:r>
+        <w:t xml:space="preserve">Few community-health platforms reach into the EMS field workflow at all. Connecting paramedic handoff directly into the same coordinated-response and clinical-alert system closes a gap that usually depends on a verbal radio report.</w:t>
+      </w:r>
+    </w:p>
+    <w:p>
+      <w:pPr>
+        <w:pStyle w:val="BodyText"/>
+      </w:pPr>
+      <w:r>
+        <w:rPr>
+          <w:b/>
+        </w:rPr>
+        <w:t xml:space="preserve">Latent Benefit:</w:t>
+      </w:r>
+      <w:r>
+        <w:t xml:space="preserve"> </w:t>
+      </w:r>
+      <w:r>
+        <w:t xml:space="preserve">Early structured EMS data feeds the same risk and bed-management engines, so the ED can pre-stage a bed and a team before the ambulance doors open.</w:t>
+      </w:r>
+    </w:p>
+    <w:p>
+      <w:r>
+        <w:pict>
+          <v:rect style="width:0;height:1.5pt" o:hralign="center" o:hrstd="t" o:hr="t"/>
+        </w:pict>
+      </w:r>
+    </w:p>
+    <w:p>
+      <w:pPr>
+        <w:pStyle w:val="Heading3"/>
+      </w:pPr>
+      <w:bookmarkStart w:id="101" w:name="Xc62422b6a6ab9297afb947d8e7e8d5085fe5dc9"/>
+      <w:r>
+        <w:t xml:space="preserve">Feature 75: Community Safety Partner Programs (Law Enforcement / Constable Dispatch)</w:t>
+      </w:r>
+      <w:bookmarkEnd w:id="101"/>
+    </w:p>
+    <w:p>
+      <w:pPr>
+        <w:pStyle w:val="FirstParagraph"/>
+      </w:pPr>
+      <w:r>
+        <w:rPr>
+          <w:b/>
+        </w:rPr>
+        <w:t xml:space="preserve">Primary Function:</w:t>
+      </w:r>
+      <w:r>
+        <w:t xml:space="preserve"> </w:t>
+      </w:r>
+      <w:r>
+        <w:t xml:space="preserve">A landing surface and dispatch-coordination view for law-enforcement and constable partner programs that participate in community wellness and safety checks.</w:t>
+      </w:r>
+    </w:p>
+    <w:p>
+      <w:pPr>
+        <w:pStyle w:val="BodyText"/>
+      </w:pPr>
+      <w:r>
+        <w:rPr>
+          <w:b/>
+        </w:rPr>
+        <w:t xml:space="preserve">System Importance:</w:t>
+      </w:r>
+      <w:r>
+        <w:t xml:space="preserve"> </w:t>
+      </w:r>
+      <w:r>
+        <w:t xml:space="preserve">Senior safety often involves non-clinical responders — welfare checks, lost-person events, constable dispatch. Giving those partners a coordinated entry point extends the safety net beyond the clinical walls.</w:t>
+      </w:r>
+    </w:p>
+    <w:p>
+      <w:pPr>
+        <w:pStyle w:val="BodyText"/>
+      </w:pPr>
+      <w:r>
+        <w:rPr>
+          <w:b/>
+        </w:rPr>
+        <w:t xml:space="preserve">Uniqueness:</w:t>
+      </w:r>
+      <w:r>
+        <w:t xml:space="preserve"> </w:t>
+      </w:r>
+      <w:r>
+        <w:t xml:space="preserve">Bridging community health and public-safety partners in one platform is unusual; it reflects the platform’s origin as a genuine community-wellness system rather than a pure clinical product.</w:t>
+      </w:r>
+    </w:p>
+    <w:p>
+      <w:pPr>
+        <w:pStyle w:val="BodyText"/>
+      </w:pPr>
+      <w:r>
+        <w:rPr>
+          <w:b/>
+        </w:rPr>
+        <w:t xml:space="preserve">Latent Benefit:</w:t>
+      </w:r>
+      <w:r>
+        <w:t xml:space="preserve"> </w:t>
+      </w:r>
+      <w:r>
+        <w:t xml:space="preserve">The same crisis-routing and emergency-event data that drives clinical alerts can inform a coordinated community-safety response, linking the</w:t>
+      </w:r>
+      <w:r>
+        <w:t xml:space="preserve"> </w:t>
+      </w:r>
+      <w:r>
+        <w:t xml:space="preserve">“</w:t>
+      </w:r>
+      <w:r>
+        <w:t xml:space="preserve">I am lost</w:t>
+      </w:r>
+      <w:r>
+        <w:t xml:space="preserve">”</w:t>
+      </w:r>
+      <w:r>
+        <w:t xml:space="preserve"> </w:t>
+      </w:r>
+      <w:r>
+        <w:t xml:space="preserve">and fall pathways to a real-world responder network.</w:t>
+      </w:r>
+    </w:p>
+    <w:p>
+      <w:r>
+        <w:pict>
+          <v:rect style="width:0;height:1.5pt" o:hralign="center" o:hrstd="t" o:hr="t"/>
+        </w:pict>
+      </w:r>
+    </w:p>
+    <w:p>
+      <w:pPr>
+        <w:pStyle w:val="Heading2"/>
+      </w:pPr>
+      <w:bookmarkStart w:id="102" w:name="summary-statistics"/>
       <w:r>
         <w:t xml:space="preserve">Summary Statistics</w:t>
       </w:r>
-      <w:bookmarkEnd w:id="86"/>
+      <w:bookmarkEnd w:id="102"/>
     </w:p>
     <w:tbl>
       <w:tblPr>
@@ -6537,7 +7946,7 @@
               <w:jc w:val="left"/>
             </w:pPr>
             <w:r>
-              <w:t xml:space="preserve">60</w:t>
+              <w:t xml:space="preserve">75</w:t>
             </w:r>
           </w:p>
         </w:tc>
@@ -6564,7 +7973,7 @@
               <w:jc w:val="left"/>
             </w:pPr>
             <w:r>
-              <w:t xml:space="preserve">18</w:t>
+              <w:t xml:space="preserve">20</w:t>
             </w:r>
           </w:p>
         </w:tc>
@@ -6591,7 +8000,7 @@
               <w:jc w:val="left"/>
             </w:pPr>
             <w:r>
-              <w:t xml:space="preserve">22</w:t>
+              <w:t xml:space="preserve">33</w:t>
             </w:r>
           </w:p>
         </w:tc>
@@ -6618,7 +8027,7 @@
               <w:jc w:val="left"/>
             </w:pPr>
             <w:r>
-              <w:t xml:space="preserve">20</w:t>
+              <w:t xml:space="preserve">22</w:t>
             </w:r>
           </w:p>
         </w:tc>
@@ -6770,11 +8179,11 @@
       <w:pPr>
         <w:pStyle w:val="Heading2"/>
       </w:pPr>
-      <w:bookmarkStart w:id="87" w:name="revenue-impact-summary"/>
+      <w:bookmarkStart w:id="103" w:name="revenue-impact-summary"/>
       <w:r>
         <w:t xml:space="preserve">Revenue Impact Summary</w:t>
       </w:r>
-      <w:bookmarkEnd w:id="87"/>
+      <w:bookmarkEnd w:id="103"/>
     </w:p>
     <w:tbl>
       <w:tblPr>

</xml_diff>